<commit_message>
putting agent/skills in .github folder
</commit_message>
<xml_diff>
--- a/extras/agent_exe_steps.docx
+++ b/extras/agent_exe_steps.docx
@@ -4551,6 +4551,9 @@
     </w:p>
     <w:p>
       <w:pPr>
+        <w:pBdr>
+          <w:bottom w:val="single" w:sz="6" w:space="1" w:color="auto"/>
+        </w:pBdr>
         <w:spacing w:before="100" w:beforeAutospacing="1" w:after="100" w:afterAutospacing="1" w:line="240" w:lineRule="auto"/>
         <w:rPr>
           <w:rFonts w:ascii="Times New Roman" w:eastAsia="Times New Roman" w:hAnsi="Times New Roman" w:cs="Times New Roman"/>
@@ -4595,6 +4598,1536 @@
           <w14:ligatures w14:val="none"/>
         </w:rPr>
         <w:t xml:space="preserve"> your Log Analyzer Agent, with full skill awareness and on-demand loading.</w:t>
+      </w:r>
+    </w:p>
+    <w:p>
+      <w:r>
+        <w:rPr>
+          <w:noProof/>
+        </w:rPr>
+        <w:lastRenderedPageBreak/>
+        <w:drawing>
+          <wp:anchor distT="0" distB="0" distL="114300" distR="114300" simplePos="0" relativeHeight="251658240" behindDoc="0" locked="0" layoutInCell="1" allowOverlap="1" wp14:anchorId="1172E92E" wp14:editId="61FFF3A0">
+            <wp:simplePos x="914400" y="914400"/>
+            <wp:positionH relativeFrom="column">
+              <wp:align>left</wp:align>
+            </wp:positionH>
+            <wp:positionV relativeFrom="paragraph">
+              <wp:align>top</wp:align>
+            </wp:positionV>
+            <wp:extent cx="4000500" cy="9172575"/>
+            <wp:effectExtent l="0" t="0" r="0" b="9525"/>
+            <wp:wrapSquare wrapText="bothSides"/>
+            <wp:docPr id="498757080" name="Picture 2"/>
+            <wp:cNvGraphicFramePr>
+              <a:graphicFrameLocks xmlns:a="http://schemas.openxmlformats.org/drawingml/2006/main" noChangeAspect="1"/>
+            </wp:cNvGraphicFramePr>
+            <a:graphic xmlns:a="http://schemas.openxmlformats.org/drawingml/2006/main">
+              <a:graphicData uri="http://schemas.openxmlformats.org/drawingml/2006/picture">
+                <pic:pic xmlns:pic="http://schemas.openxmlformats.org/drawingml/2006/picture">
+                  <pic:nvPicPr>
+                    <pic:cNvPr id="0" name="Picture 2"/>
+                    <pic:cNvPicPr>
+                      <a:picLocks noChangeAspect="1" noChangeArrowheads="1"/>
+                    </pic:cNvPicPr>
+                  </pic:nvPicPr>
+                  <pic:blipFill>
+                    <a:blip r:embed="rId4">
+                      <a:extLst>
+                        <a:ext uri="{28A0092B-C50C-407E-A947-70E740481C1C}">
+                          <a14:useLocalDpi xmlns:a14="http://schemas.microsoft.com/office/drawing/2010/main" val="0"/>
+                        </a:ext>
+                      </a:extLst>
+                    </a:blip>
+                    <a:srcRect/>
+                    <a:stretch>
+                      <a:fillRect/>
+                    </a:stretch>
+                  </pic:blipFill>
+                  <pic:spPr bwMode="auto">
+                    <a:xfrm>
+                      <a:off x="0" y="0"/>
+                      <a:ext cx="4000500" cy="9172575"/>
+                    </a:xfrm>
+                    <a:prstGeom prst="rect">
+                      <a:avLst/>
+                    </a:prstGeom>
+                    <a:noFill/>
+                  </pic:spPr>
+                </pic:pic>
+              </a:graphicData>
+            </a:graphic>
+          </wp:anchor>
+        </w:drawing>
+      </w:r>
+      <w:r>
+        <w:br w:type="textWrapping" w:clear="all"/>
+      </w:r>
+    </w:p>
+    <w:p>
+      <w:pPr>
+        <w:spacing w:before="100" w:beforeAutospacing="1" w:after="100" w:afterAutospacing="1" w:line="240" w:lineRule="auto"/>
+        <w:outlineLvl w:val="2"/>
+        <w:rPr>
+          <w:rFonts w:ascii="Times New Roman" w:eastAsia="Times New Roman" w:hAnsi="Times New Roman" w:cs="Times New Roman"/>
+          <w:b/>
+          <w:bCs/>
+          <w:kern w:val="0"/>
+          <w:sz w:val="27"/>
+          <w:szCs w:val="27"/>
+          <w:lang w:eastAsia="en-IN"/>
+          <w14:ligatures w14:val="none"/>
+        </w:rPr>
+      </w:pPr>
+      <w:r>
+        <w:rPr>
+          <w:rFonts w:ascii="Times New Roman" w:eastAsia="Times New Roman" w:hAnsi="Times New Roman" w:cs="Times New Roman"/>
+          <w:b/>
+          <w:bCs/>
+          <w:kern w:val="0"/>
+          <w:sz w:val="27"/>
+          <w:szCs w:val="27"/>
+          <w:lang w:eastAsia="en-IN"/>
+          <w14:ligatures w14:val="none"/>
+        </w:rPr>
+        <w:t>What the Todo List Is</w:t>
+      </w:r>
+    </w:p>
+    <w:p>
+      <w:pPr>
+        <w:spacing w:before="100" w:beforeAutospacing="1" w:after="100" w:afterAutospacing="1" w:line="240" w:lineRule="auto"/>
+        <w:rPr>
+          <w:rFonts w:ascii="Times New Roman" w:eastAsia="Times New Roman" w:hAnsi="Times New Roman" w:cs="Times New Roman"/>
+          <w:kern w:val="0"/>
+          <w:sz w:val="24"/>
+          <w:szCs w:val="24"/>
+          <w:lang w:eastAsia="en-IN"/>
+          <w14:ligatures w14:val="none"/>
+        </w:rPr>
+      </w:pPr>
+      <w:r>
+        <w:rPr>
+          <w:rFonts w:ascii="Times New Roman" w:eastAsia="Times New Roman" w:hAnsi="Times New Roman" w:cs="Times New Roman"/>
+          <w:kern w:val="0"/>
+          <w:sz w:val="24"/>
+          <w:szCs w:val="24"/>
+          <w:lang w:eastAsia="en-IN"/>
+          <w14:ligatures w14:val="none"/>
+        </w:rPr>
+        <w:t xml:space="preserve">The </w:t>
+      </w:r>
+      <w:r>
+        <w:rPr>
+          <w:rFonts w:ascii="Times New Roman" w:eastAsia="Times New Roman" w:hAnsi="Times New Roman" w:cs="Times New Roman"/>
+          <w:b/>
+          <w:bCs/>
+          <w:kern w:val="0"/>
+          <w:sz w:val="24"/>
+          <w:szCs w:val="24"/>
+          <w:lang w:eastAsia="en-IN"/>
+          <w14:ligatures w14:val="none"/>
+        </w:rPr>
+        <w:t>Todos (2/4)</w:t>
+      </w:r>
+      <w:r>
+        <w:rPr>
+          <w:rFonts w:ascii="Times New Roman" w:eastAsia="Times New Roman" w:hAnsi="Times New Roman" w:cs="Times New Roman"/>
+          <w:kern w:val="0"/>
+          <w:sz w:val="24"/>
+          <w:szCs w:val="24"/>
+          <w:lang w:eastAsia="en-IN"/>
+          <w14:ligatures w14:val="none"/>
+        </w:rPr>
+        <w:t xml:space="preserve"> panel is </w:t>
+      </w:r>
+      <w:r>
+        <w:rPr>
+          <w:rFonts w:ascii="Times New Roman" w:eastAsia="Times New Roman" w:hAnsi="Times New Roman" w:cs="Times New Roman"/>
+          <w:b/>
+          <w:bCs/>
+          <w:kern w:val="0"/>
+          <w:sz w:val="24"/>
+          <w:szCs w:val="24"/>
+          <w:lang w:eastAsia="en-IN"/>
+          <w14:ligatures w14:val="none"/>
+        </w:rPr>
+        <w:t>VS Code Copilot's built-in task planner</w:t>
+      </w:r>
+      <w:r>
+        <w:rPr>
+          <w:rFonts w:ascii="Times New Roman" w:eastAsia="Times New Roman" w:hAnsi="Times New Roman" w:cs="Times New Roman"/>
+          <w:kern w:val="0"/>
+          <w:sz w:val="24"/>
+          <w:szCs w:val="24"/>
+          <w:lang w:eastAsia="en-IN"/>
+          <w14:ligatures w14:val="none"/>
+        </w:rPr>
+        <w:t xml:space="preserve"> — it's auto-generated by the LLM based on your </w:t>
+      </w:r>
+      <w:r>
+        <w:rPr>
+          <w:rFonts w:ascii="Courier New" w:eastAsia="Times New Roman" w:hAnsi="Courier New" w:cs="Courier New"/>
+          <w:kern w:val="0"/>
+          <w:sz w:val="20"/>
+          <w:szCs w:val="20"/>
+          <w:lang w:eastAsia="en-IN"/>
+          <w14:ligatures w14:val="none"/>
+        </w:rPr>
+        <w:t>agent.md</w:t>
+      </w:r>
+      <w:r>
+        <w:rPr>
+          <w:rFonts w:ascii="Times New Roman" w:eastAsia="Times New Roman" w:hAnsi="Times New Roman" w:cs="Times New Roman"/>
+          <w:kern w:val="0"/>
+          <w:sz w:val="24"/>
+          <w:szCs w:val="24"/>
+          <w:lang w:eastAsia="en-IN"/>
+          <w14:ligatures w14:val="none"/>
+        </w:rPr>
+        <w:t xml:space="preserve"> routing rules. It's </w:t>
+      </w:r>
+      <w:r>
+        <w:rPr>
+          <w:rFonts w:ascii="Times New Roman" w:eastAsia="Times New Roman" w:hAnsi="Times New Roman" w:cs="Times New Roman"/>
+          <w:b/>
+          <w:bCs/>
+          <w:kern w:val="0"/>
+          <w:sz w:val="24"/>
+          <w:szCs w:val="24"/>
+          <w:lang w:eastAsia="en-IN"/>
+          <w14:ligatures w14:val="none"/>
+        </w:rPr>
+        <w:t>not configured in any file</w:t>
+      </w:r>
+      <w:r>
+        <w:rPr>
+          <w:rFonts w:ascii="Times New Roman" w:eastAsia="Times New Roman" w:hAnsi="Times New Roman" w:cs="Times New Roman"/>
+          <w:kern w:val="0"/>
+          <w:sz w:val="24"/>
+          <w:szCs w:val="24"/>
+          <w:lang w:eastAsia="en-IN"/>
+          <w14:ligatures w14:val="none"/>
+        </w:rPr>
+        <w:t xml:space="preserve"> — Copilot creates it dynamically from the skill execution plan.</w:t>
+      </w:r>
+    </w:p>
+    <w:p>
+      <w:pPr>
+        <w:tabs>
+          <w:tab w:val="left" w:pos="916"/>
+          <w:tab w:val="left" w:pos="1832"/>
+          <w:tab w:val="left" w:pos="2748"/>
+          <w:tab w:val="left" w:pos="3664"/>
+          <w:tab w:val="left" w:pos="4580"/>
+          <w:tab w:val="left" w:pos="5496"/>
+          <w:tab w:val="left" w:pos="6412"/>
+          <w:tab w:val="left" w:pos="7328"/>
+          <w:tab w:val="left" w:pos="8244"/>
+          <w:tab w:val="left" w:pos="9160"/>
+          <w:tab w:val="left" w:pos="10076"/>
+          <w:tab w:val="left" w:pos="10992"/>
+          <w:tab w:val="left" w:pos="11908"/>
+          <w:tab w:val="left" w:pos="12824"/>
+          <w:tab w:val="left" w:pos="13740"/>
+          <w:tab w:val="left" w:pos="14656"/>
+        </w:tabs>
+        <w:spacing w:after="0" w:line="240" w:lineRule="auto"/>
+        <w:rPr>
+          <w:rFonts w:ascii="var(--font-mono)" w:eastAsia="Times New Roman" w:hAnsi="var(--font-mono)" w:cs="Courier New"/>
+          <w:color w:val="14181F"/>
+          <w:kern w:val="0"/>
+          <w:sz w:val="20"/>
+          <w:szCs w:val="20"/>
+          <w:lang w:eastAsia="en-IN"/>
+          <w14:ligatures w14:val="none"/>
+        </w:rPr>
+      </w:pPr>
+      <w:r>
+        <w:rPr>
+          <w:rFonts w:ascii="Segoe UI Emoji" w:eastAsia="Times New Roman" w:hAnsi="Segoe UI Emoji" w:cs="Segoe UI Emoji"/>
+          <w:color w:val="14181F"/>
+          <w:kern w:val="0"/>
+          <w:sz w:val="20"/>
+          <w:szCs w:val="20"/>
+          <w:lang w:eastAsia="en-IN"/>
+          <w14:ligatures w14:val="none"/>
+        </w:rPr>
+        <w:t>✅</w:t>
+      </w:r>
+      <w:r>
+        <w:rPr>
+          <w:rFonts w:ascii="var(--font-mono)" w:eastAsia="Times New Roman" w:hAnsi="var(--font-mono)" w:cs="Courier New"/>
+          <w:color w:val="14181F"/>
+          <w:kern w:val="0"/>
+          <w:sz w:val="20"/>
+          <w:szCs w:val="20"/>
+          <w:lang w:eastAsia="en-IN"/>
+          <w14:ligatures w14:val="none"/>
+        </w:rPr>
+        <w:t xml:space="preserve"> Create plan and run parser        </w:t>
+      </w:r>
+      <w:r>
+        <w:rPr>
+          <w:rFonts w:ascii="Cambria" w:eastAsia="Times New Roman" w:hAnsi="Cambria" w:cs="Cambria"/>
+          <w:color w:val="14181F"/>
+          <w:kern w:val="0"/>
+          <w:sz w:val="20"/>
+          <w:szCs w:val="20"/>
+          <w:lang w:eastAsia="en-IN"/>
+          <w14:ligatures w14:val="none"/>
+        </w:rPr>
+        <w:t>←</w:t>
+      </w:r>
+      <w:r>
+        <w:rPr>
+          <w:rFonts w:ascii="var(--font-mono)" w:eastAsia="Times New Roman" w:hAnsi="var(--font-mono)" w:cs="Courier New"/>
+          <w:color w:val="14181F"/>
+          <w:kern w:val="0"/>
+          <w:sz w:val="20"/>
+          <w:szCs w:val="20"/>
+          <w:lang w:eastAsia="en-IN"/>
+          <w14:ligatures w14:val="none"/>
+        </w:rPr>
+        <w:t xml:space="preserve"> completed</w:t>
+      </w:r>
+    </w:p>
+    <w:p>
+      <w:pPr>
+        <w:tabs>
+          <w:tab w:val="left" w:pos="916"/>
+          <w:tab w:val="left" w:pos="1832"/>
+          <w:tab w:val="left" w:pos="2748"/>
+          <w:tab w:val="left" w:pos="3664"/>
+          <w:tab w:val="left" w:pos="4580"/>
+          <w:tab w:val="left" w:pos="5496"/>
+          <w:tab w:val="left" w:pos="6412"/>
+          <w:tab w:val="left" w:pos="7328"/>
+          <w:tab w:val="left" w:pos="8244"/>
+          <w:tab w:val="left" w:pos="9160"/>
+          <w:tab w:val="left" w:pos="10076"/>
+          <w:tab w:val="left" w:pos="10992"/>
+          <w:tab w:val="left" w:pos="11908"/>
+          <w:tab w:val="left" w:pos="12824"/>
+          <w:tab w:val="left" w:pos="13740"/>
+          <w:tab w:val="left" w:pos="14656"/>
+        </w:tabs>
+        <w:spacing w:after="0" w:line="240" w:lineRule="auto"/>
+        <w:rPr>
+          <w:rFonts w:ascii="var(--font-mono)" w:eastAsia="Times New Roman" w:hAnsi="var(--font-mono)" w:cs="Courier New"/>
+          <w:color w:val="14181F"/>
+          <w:kern w:val="0"/>
+          <w:sz w:val="20"/>
+          <w:szCs w:val="20"/>
+          <w:lang w:eastAsia="en-IN"/>
+          <w14:ligatures w14:val="none"/>
+        </w:rPr>
+      </w:pPr>
+      <w:r>
+        <w:rPr>
+          <w:rFonts w:ascii="Segoe UI Emoji" w:eastAsia="Times New Roman" w:hAnsi="Segoe UI Emoji" w:cs="Segoe UI Emoji"/>
+          <w:color w:val="14181F"/>
+          <w:kern w:val="0"/>
+          <w:sz w:val="20"/>
+          <w:szCs w:val="20"/>
+          <w:lang w:eastAsia="en-IN"/>
+          <w14:ligatures w14:val="none"/>
+        </w:rPr>
+        <w:t>🔵</w:t>
+      </w:r>
+      <w:r>
+        <w:rPr>
+          <w:rFonts w:ascii="var(--font-mono)" w:eastAsia="Times New Roman" w:hAnsi="var(--font-mono)" w:cs="Courier New"/>
+          <w:color w:val="14181F"/>
+          <w:kern w:val="0"/>
+          <w:sz w:val="20"/>
+          <w:szCs w:val="20"/>
+          <w:lang w:eastAsia="en-IN"/>
+          <w14:ligatures w14:val="none"/>
+        </w:rPr>
+        <w:t xml:space="preserve"> Run error-detection if requested  ← pending (waiting for your input)</w:t>
+      </w:r>
+    </w:p>
+    <w:p>
+      <w:pPr>
+        <w:tabs>
+          <w:tab w:val="left" w:pos="916"/>
+          <w:tab w:val="left" w:pos="1832"/>
+          <w:tab w:val="left" w:pos="2748"/>
+          <w:tab w:val="left" w:pos="3664"/>
+          <w:tab w:val="left" w:pos="4580"/>
+          <w:tab w:val="left" w:pos="5496"/>
+          <w:tab w:val="left" w:pos="6412"/>
+          <w:tab w:val="left" w:pos="7328"/>
+          <w:tab w:val="left" w:pos="8244"/>
+          <w:tab w:val="left" w:pos="9160"/>
+          <w:tab w:val="left" w:pos="10076"/>
+          <w:tab w:val="left" w:pos="10992"/>
+          <w:tab w:val="left" w:pos="11908"/>
+          <w:tab w:val="left" w:pos="12824"/>
+          <w:tab w:val="left" w:pos="13740"/>
+          <w:tab w:val="left" w:pos="14656"/>
+        </w:tabs>
+        <w:spacing w:after="0" w:line="240" w:lineRule="auto"/>
+        <w:rPr>
+          <w:rFonts w:ascii="var(--font-mono)" w:eastAsia="Times New Roman" w:hAnsi="var(--font-mono)" w:cs="Courier New"/>
+          <w:color w:val="14181F"/>
+          <w:kern w:val="0"/>
+          <w:sz w:val="20"/>
+          <w:szCs w:val="20"/>
+          <w:lang w:eastAsia="en-IN"/>
+          <w14:ligatures w14:val="none"/>
+        </w:rPr>
+      </w:pPr>
+      <w:r>
+        <w:rPr>
+          <w:rFonts w:ascii="Segoe UI Emoji" w:eastAsia="Times New Roman" w:hAnsi="Segoe UI Emoji" w:cs="Segoe UI Emoji"/>
+          <w:color w:val="14181F"/>
+          <w:kern w:val="0"/>
+          <w:sz w:val="20"/>
+          <w:szCs w:val="20"/>
+          <w:lang w:eastAsia="en-IN"/>
+          <w14:ligatures w14:val="none"/>
+        </w:rPr>
+        <w:t>🔵</w:t>
+      </w:r>
+      <w:r>
+        <w:rPr>
+          <w:rFonts w:ascii="var(--font-mono)" w:eastAsia="Times New Roman" w:hAnsi="var(--font-mono)" w:cs="Courier New"/>
+          <w:color w:val="14181F"/>
+          <w:kern w:val="0"/>
+          <w:sz w:val="20"/>
+          <w:szCs w:val="20"/>
+          <w:lang w:eastAsia="en-IN"/>
+          <w14:ligatures w14:val="none"/>
+        </w:rPr>
+        <w:t xml:space="preserve"> Run pattern-analysis if requested ← pending</w:t>
+      </w:r>
+    </w:p>
+    <w:p>
+      <w:pPr>
+        <w:tabs>
+          <w:tab w:val="left" w:pos="916"/>
+          <w:tab w:val="left" w:pos="1832"/>
+          <w:tab w:val="left" w:pos="2748"/>
+          <w:tab w:val="left" w:pos="3664"/>
+          <w:tab w:val="left" w:pos="4580"/>
+          <w:tab w:val="left" w:pos="5496"/>
+          <w:tab w:val="left" w:pos="6412"/>
+          <w:tab w:val="left" w:pos="7328"/>
+          <w:tab w:val="left" w:pos="8244"/>
+          <w:tab w:val="left" w:pos="9160"/>
+          <w:tab w:val="left" w:pos="10076"/>
+          <w:tab w:val="left" w:pos="10992"/>
+          <w:tab w:val="left" w:pos="11908"/>
+          <w:tab w:val="left" w:pos="12824"/>
+          <w:tab w:val="left" w:pos="13740"/>
+          <w:tab w:val="left" w:pos="14656"/>
+        </w:tabs>
+        <w:spacing w:after="0" w:line="240" w:lineRule="auto"/>
+        <w:rPr>
+          <w:rFonts w:ascii="var(--font-mono)" w:eastAsia="Times New Roman" w:hAnsi="var(--font-mono)" w:cs="Courier New"/>
+          <w:color w:val="14181F"/>
+          <w:kern w:val="0"/>
+          <w:sz w:val="20"/>
+          <w:szCs w:val="20"/>
+          <w:lang w:eastAsia="en-IN"/>
+          <w14:ligatures w14:val="none"/>
+        </w:rPr>
+      </w:pPr>
+      <w:r>
+        <w:rPr>
+          <w:rFonts w:ascii="Segoe UI Emoji" w:eastAsia="Times New Roman" w:hAnsi="Segoe UI Emoji" w:cs="Segoe UI Emoji"/>
+          <w:color w:val="14181F"/>
+          <w:kern w:val="0"/>
+          <w:sz w:val="20"/>
+          <w:szCs w:val="20"/>
+          <w:lang w:eastAsia="en-IN"/>
+          <w14:ligatures w14:val="none"/>
+        </w:rPr>
+        <w:t>⚪</w:t>
+      </w:r>
+      <w:r>
+        <w:rPr>
+          <w:rFonts w:ascii="var(--font-mono)" w:eastAsia="Times New Roman" w:hAnsi="var(--font-mono)" w:cs="Courier New"/>
+          <w:color w:val="14181F"/>
+          <w:kern w:val="0"/>
+          <w:sz w:val="20"/>
+          <w:szCs w:val="20"/>
+          <w:lang w:eastAsia="en-IN"/>
+          <w14:ligatures w14:val="none"/>
+        </w:rPr>
+        <w:t xml:space="preserve"> Generate report if requested      </w:t>
+      </w:r>
+      <w:r>
+        <w:rPr>
+          <w:rFonts w:ascii="Cambria" w:eastAsia="Times New Roman" w:hAnsi="Cambria" w:cs="Cambria"/>
+          <w:color w:val="14181F"/>
+          <w:kern w:val="0"/>
+          <w:sz w:val="20"/>
+          <w:szCs w:val="20"/>
+          <w:lang w:eastAsia="en-IN"/>
+          <w14:ligatures w14:val="none"/>
+        </w:rPr>
+        <w:t>←</w:t>
+      </w:r>
+      <w:r>
+        <w:rPr>
+          <w:rFonts w:ascii="var(--font-mono)" w:eastAsia="Times New Roman" w:hAnsi="var(--font-mono)" w:cs="Courier New"/>
+          <w:color w:val="14181F"/>
+          <w:kern w:val="0"/>
+          <w:sz w:val="20"/>
+          <w:szCs w:val="20"/>
+          <w:lang w:eastAsia="en-IN"/>
+          <w14:ligatures w14:val="none"/>
+        </w:rPr>
+        <w:t xml:space="preserve"> pending</w:t>
+      </w:r>
+    </w:p>
+    <w:p>
+      <w:pPr>
+        <w:spacing w:before="100" w:beforeAutospacing="1" w:after="100" w:afterAutospacing="1" w:line="240" w:lineRule="auto"/>
+        <w:outlineLvl w:val="2"/>
+        <w:rPr>
+          <w:rFonts w:ascii="Times New Roman" w:eastAsia="Times New Roman" w:hAnsi="Times New Roman" w:cs="Times New Roman"/>
+          <w:b/>
+          <w:bCs/>
+          <w:kern w:val="0"/>
+          <w:sz w:val="27"/>
+          <w:szCs w:val="27"/>
+          <w:lang w:eastAsia="en-IN"/>
+          <w14:ligatures w14:val="none"/>
+        </w:rPr>
+      </w:pPr>
+      <w:r>
+        <w:rPr>
+          <w:rFonts w:ascii="Times New Roman" w:eastAsia="Times New Roman" w:hAnsi="Times New Roman" w:cs="Times New Roman"/>
+          <w:b/>
+          <w:bCs/>
+          <w:kern w:val="0"/>
+          <w:sz w:val="27"/>
+          <w:szCs w:val="27"/>
+          <w:lang w:eastAsia="en-IN"/>
+          <w14:ligatures w14:val="none"/>
+        </w:rPr>
+        <w:t>Why It Behaves This Way</w:t>
+      </w:r>
+    </w:p>
+    <w:p>
+      <w:pPr>
+        <w:spacing w:before="100" w:beforeAutospacing="1" w:after="100" w:afterAutospacing="1" w:line="240" w:lineRule="auto"/>
+        <w:rPr>
+          <w:rFonts w:ascii="Times New Roman" w:eastAsia="Times New Roman" w:hAnsi="Times New Roman" w:cs="Times New Roman"/>
+          <w:kern w:val="0"/>
+          <w:sz w:val="24"/>
+          <w:szCs w:val="24"/>
+          <w:lang w:eastAsia="en-IN"/>
+          <w14:ligatures w14:val="none"/>
+        </w:rPr>
+      </w:pPr>
+      <w:r>
+        <w:rPr>
+          <w:rFonts w:ascii="Times New Roman" w:eastAsia="Times New Roman" w:hAnsi="Times New Roman" w:cs="Times New Roman"/>
+          <w:kern w:val="0"/>
+          <w:sz w:val="24"/>
+          <w:szCs w:val="24"/>
+          <w:lang w:eastAsia="en-IN"/>
+          <w14:ligatures w14:val="none"/>
+        </w:rPr>
+        <w:t xml:space="preserve">Your </w:t>
+      </w:r>
+      <w:r>
+        <w:rPr>
+          <w:rFonts w:ascii="Courier New" w:eastAsia="Times New Roman" w:hAnsi="Courier New" w:cs="Courier New"/>
+          <w:kern w:val="0"/>
+          <w:sz w:val="20"/>
+          <w:szCs w:val="20"/>
+          <w:lang w:eastAsia="en-IN"/>
+          <w14:ligatures w14:val="none"/>
+        </w:rPr>
+        <w:t>agent.md</w:t>
+      </w:r>
+      <w:r>
+        <w:rPr>
+          <w:rFonts w:ascii="Times New Roman" w:eastAsia="Times New Roman" w:hAnsi="Times New Roman" w:cs="Times New Roman"/>
+          <w:kern w:val="0"/>
+          <w:sz w:val="24"/>
+          <w:szCs w:val="24"/>
+          <w:lang w:eastAsia="en-IN"/>
+          <w14:ligatures w14:val="none"/>
+        </w:rPr>
+        <w:t xml:space="preserve"> says:</w:t>
+      </w:r>
+    </w:p>
+    <w:p>
+      <w:pPr>
+        <w:spacing w:after="0" w:line="240" w:lineRule="auto"/>
+        <w:rPr>
+          <w:rFonts w:ascii="Times New Roman" w:eastAsia="Times New Roman" w:hAnsi="Times New Roman" w:cs="Times New Roman"/>
+          <w:kern w:val="0"/>
+          <w:sz w:val="24"/>
+          <w:szCs w:val="24"/>
+          <w:lang w:eastAsia="en-IN"/>
+          <w14:ligatures w14:val="none"/>
+        </w:rPr>
+      </w:pPr>
+      <w:r>
+        <w:rPr>
+          <w:rFonts w:ascii="Times New Roman" w:eastAsia="Times New Roman" w:hAnsi="Times New Roman" w:cs="Times New Roman"/>
+          <w:kern w:val="0"/>
+          <w:sz w:val="24"/>
+          <w:szCs w:val="24"/>
+          <w:lang w:eastAsia="en-IN"/>
+          <w14:ligatures w14:val="none"/>
+        </w:rPr>
+        <w:t>markdown</w:t>
+      </w:r>
+    </w:p>
+    <w:p>
+      <w:pPr>
+        <w:tabs>
+          <w:tab w:val="left" w:pos="916"/>
+          <w:tab w:val="left" w:pos="1832"/>
+          <w:tab w:val="left" w:pos="2748"/>
+          <w:tab w:val="left" w:pos="3664"/>
+          <w:tab w:val="left" w:pos="4580"/>
+          <w:tab w:val="left" w:pos="5496"/>
+          <w:tab w:val="left" w:pos="6412"/>
+          <w:tab w:val="left" w:pos="7328"/>
+          <w:tab w:val="left" w:pos="8244"/>
+          <w:tab w:val="left" w:pos="9160"/>
+          <w:tab w:val="left" w:pos="10076"/>
+          <w:tab w:val="left" w:pos="10992"/>
+          <w:tab w:val="left" w:pos="11908"/>
+          <w:tab w:val="left" w:pos="12824"/>
+          <w:tab w:val="left" w:pos="13740"/>
+          <w:tab w:val="left" w:pos="14656"/>
+        </w:tabs>
+        <w:spacing w:after="0" w:line="240" w:lineRule="auto"/>
+        <w:rPr>
+          <w:rFonts w:ascii="var(--font-mono)" w:eastAsia="Times New Roman" w:hAnsi="var(--font-mono)" w:cs="Courier New"/>
+          <w:color w:val="14181F"/>
+          <w:kern w:val="0"/>
+          <w:sz w:val="20"/>
+          <w:szCs w:val="20"/>
+          <w:lang w:eastAsia="en-IN"/>
+          <w14:ligatures w14:val="none"/>
+        </w:rPr>
+      </w:pPr>
+      <w:r>
+        <w:rPr>
+          <w:rFonts w:ascii="var(--font-mono)" w:eastAsia="Times New Roman" w:hAnsi="var(--font-mono)" w:cs="Courier New"/>
+          <w:color w:val="14181F"/>
+          <w:kern w:val="0"/>
+          <w:sz w:val="20"/>
+          <w:szCs w:val="20"/>
+          <w:lang w:eastAsia="en-IN"/>
+          <w14:ligatures w14:val="none"/>
+        </w:rPr>
+        <w:t>Only load a skill's SKILL.md when that specific task is requested</w:t>
+      </w:r>
+    </w:p>
+    <w:p>
+      <w:pPr>
+        <w:spacing w:before="100" w:beforeAutospacing="1" w:after="100" w:afterAutospacing="1" w:line="240" w:lineRule="auto"/>
+        <w:rPr>
+          <w:rFonts w:ascii="Times New Roman" w:eastAsia="Times New Roman" w:hAnsi="Times New Roman" w:cs="Times New Roman"/>
+          <w:kern w:val="0"/>
+          <w:sz w:val="24"/>
+          <w:szCs w:val="24"/>
+          <w:lang w:eastAsia="en-IN"/>
+          <w14:ligatures w14:val="none"/>
+        </w:rPr>
+      </w:pPr>
+      <w:r>
+        <w:rPr>
+          <w:rFonts w:ascii="Times New Roman" w:eastAsia="Times New Roman" w:hAnsi="Times New Roman" w:cs="Times New Roman"/>
+          <w:kern w:val="0"/>
+          <w:sz w:val="24"/>
+          <w:szCs w:val="24"/>
+          <w:lang w:eastAsia="en-IN"/>
+          <w14:ligatures w14:val="none"/>
+        </w:rPr>
+        <w:t xml:space="preserve">So Copilot plans all possible steps upfront but </w:t>
+      </w:r>
+      <w:r>
+        <w:rPr>
+          <w:rFonts w:ascii="Times New Roman" w:eastAsia="Times New Roman" w:hAnsi="Times New Roman" w:cs="Times New Roman"/>
+          <w:b/>
+          <w:bCs/>
+          <w:kern w:val="0"/>
+          <w:sz w:val="24"/>
+          <w:szCs w:val="24"/>
+          <w:lang w:eastAsia="en-IN"/>
+          <w14:ligatures w14:val="none"/>
+        </w:rPr>
+        <w:t>waits for confirmation</w:t>
+      </w:r>
+      <w:r>
+        <w:rPr>
+          <w:rFonts w:ascii="Times New Roman" w:eastAsia="Times New Roman" w:hAnsi="Times New Roman" w:cs="Times New Roman"/>
+          <w:kern w:val="0"/>
+          <w:sz w:val="24"/>
+          <w:szCs w:val="24"/>
+          <w:lang w:eastAsia="en-IN"/>
+          <w14:ligatures w14:val="none"/>
+        </w:rPr>
+        <w:t xml:space="preserve"> before executing each one — this is the </w:t>
+      </w:r>
+      <w:r>
+        <w:rPr>
+          <w:rFonts w:ascii="Courier New" w:eastAsia="Times New Roman" w:hAnsi="Courier New" w:cs="Courier New"/>
+          <w:kern w:val="0"/>
+          <w:sz w:val="20"/>
+          <w:szCs w:val="20"/>
+          <w:lang w:eastAsia="en-IN"/>
+          <w14:ligatures w14:val="none"/>
+        </w:rPr>
+        <w:t>Default Approvals</w:t>
+      </w:r>
+      <w:r>
+        <w:rPr>
+          <w:rFonts w:ascii="Times New Roman" w:eastAsia="Times New Roman" w:hAnsi="Times New Roman" w:cs="Times New Roman"/>
+          <w:kern w:val="0"/>
+          <w:sz w:val="24"/>
+          <w:szCs w:val="24"/>
+          <w:lang w:eastAsia="en-IN"/>
+          <w14:ligatures w14:val="none"/>
+        </w:rPr>
+        <w:t xml:space="preserve"> mode you can see at the bottom of your screenshot.</w:t>
+      </w:r>
+    </w:p>
+    <w:p>
+      <w:pPr>
+        <w:spacing w:before="100" w:beforeAutospacing="1" w:after="100" w:afterAutospacing="1" w:line="240" w:lineRule="auto"/>
+        <w:outlineLvl w:val="2"/>
+        <w:rPr>
+          <w:rFonts w:ascii="Times New Roman" w:eastAsia="Times New Roman" w:hAnsi="Times New Roman" w:cs="Times New Roman"/>
+          <w:b/>
+          <w:bCs/>
+          <w:kern w:val="0"/>
+          <w:sz w:val="27"/>
+          <w:szCs w:val="27"/>
+          <w:lang w:eastAsia="en-IN"/>
+          <w14:ligatures w14:val="none"/>
+        </w:rPr>
+      </w:pPr>
+      <w:r>
+        <w:rPr>
+          <w:rFonts w:ascii="Times New Roman" w:eastAsia="Times New Roman" w:hAnsi="Times New Roman" w:cs="Times New Roman"/>
+          <w:b/>
+          <w:bCs/>
+          <w:kern w:val="0"/>
+          <w:sz w:val="27"/>
+          <w:szCs w:val="27"/>
+          <w:lang w:eastAsia="en-IN"/>
+          <w14:ligatures w14:val="none"/>
+        </w:rPr>
+        <w:t>How to Control It</w:t>
+      </w:r>
+    </w:p>
+    <w:p>
+      <w:pPr>
+        <w:spacing w:before="100" w:beforeAutospacing="1" w:after="100" w:afterAutospacing="1" w:line="240" w:lineRule="auto"/>
+        <w:rPr>
+          <w:rFonts w:ascii="Times New Roman" w:eastAsia="Times New Roman" w:hAnsi="Times New Roman" w:cs="Times New Roman"/>
+          <w:kern w:val="0"/>
+          <w:sz w:val="24"/>
+          <w:szCs w:val="24"/>
+          <w:lang w:eastAsia="en-IN"/>
+          <w14:ligatures w14:val="none"/>
+        </w:rPr>
+      </w:pPr>
+      <w:r>
+        <w:rPr>
+          <w:rFonts w:ascii="Times New Roman" w:eastAsia="Times New Roman" w:hAnsi="Times New Roman" w:cs="Times New Roman"/>
+          <w:b/>
+          <w:bCs/>
+          <w:kern w:val="0"/>
+          <w:sz w:val="24"/>
+          <w:szCs w:val="24"/>
+          <w:lang w:eastAsia="en-IN"/>
+          <w14:ligatures w14:val="none"/>
+        </w:rPr>
+        <w:t>Option 1 — Auto-approve all steps</w:t>
+      </w:r>
+      <w:r>
+        <w:rPr>
+          <w:rFonts w:ascii="Times New Roman" w:eastAsia="Times New Roman" w:hAnsi="Times New Roman" w:cs="Times New Roman"/>
+          <w:kern w:val="0"/>
+          <w:sz w:val="24"/>
+          <w:szCs w:val="24"/>
+          <w:lang w:eastAsia="en-IN"/>
+          <w14:ligatures w14:val="none"/>
+        </w:rPr>
+        <w:t xml:space="preserve"> (run full pipeline without prompts):</w:t>
+      </w:r>
+    </w:p>
+    <w:p>
+      <w:pPr>
+        <w:spacing w:before="100" w:beforeAutospacing="1" w:after="100" w:afterAutospacing="1" w:line="240" w:lineRule="auto"/>
+        <w:rPr>
+          <w:rFonts w:ascii="Times New Roman" w:eastAsia="Times New Roman" w:hAnsi="Times New Roman" w:cs="Times New Roman"/>
+          <w:kern w:val="0"/>
+          <w:sz w:val="24"/>
+          <w:szCs w:val="24"/>
+          <w:lang w:eastAsia="en-IN"/>
+          <w14:ligatures w14:val="none"/>
+        </w:rPr>
+      </w:pPr>
+      <w:r>
+        <w:rPr>
+          <w:rFonts w:ascii="Times New Roman" w:eastAsia="Times New Roman" w:hAnsi="Times New Roman" w:cs="Times New Roman"/>
+          <w:kern w:val="0"/>
+          <w:sz w:val="24"/>
+          <w:szCs w:val="24"/>
+          <w:lang w:eastAsia="en-IN"/>
+          <w14:ligatures w14:val="none"/>
+        </w:rPr>
+        <w:t xml:space="preserve">Bottom bar → click </w:t>
+      </w:r>
+      <w:r>
+        <w:rPr>
+          <w:rFonts w:ascii="Courier New" w:eastAsia="Times New Roman" w:hAnsi="Courier New" w:cs="Courier New"/>
+          <w:kern w:val="0"/>
+          <w:sz w:val="20"/>
+          <w:szCs w:val="20"/>
+          <w:lang w:eastAsia="en-IN"/>
+          <w14:ligatures w14:val="none"/>
+        </w:rPr>
+        <w:t>Default Approvals</w:t>
+      </w:r>
+      <w:r>
+        <w:rPr>
+          <w:rFonts w:ascii="Times New Roman" w:eastAsia="Times New Roman" w:hAnsi="Times New Roman" w:cs="Times New Roman"/>
+          <w:kern w:val="0"/>
+          <w:sz w:val="24"/>
+          <w:szCs w:val="24"/>
+          <w:lang w:eastAsia="en-IN"/>
+          <w14:ligatures w14:val="none"/>
+        </w:rPr>
+        <w:t xml:space="preserve"> → change to </w:t>
+      </w:r>
+      <w:r>
+        <w:rPr>
+          <w:rFonts w:ascii="Courier New" w:eastAsia="Times New Roman" w:hAnsi="Courier New" w:cs="Courier New"/>
+          <w:b/>
+          <w:bCs/>
+          <w:kern w:val="0"/>
+          <w:sz w:val="20"/>
+          <w:szCs w:val="20"/>
+          <w:lang w:eastAsia="en-IN"/>
+          <w14:ligatures w14:val="none"/>
+        </w:rPr>
+        <w:t>Auto</w:t>
+      </w:r>
+    </w:p>
+    <w:p>
+      <w:pPr>
+        <w:spacing w:before="100" w:beforeAutospacing="1" w:after="100" w:afterAutospacing="1" w:line="240" w:lineRule="auto"/>
+        <w:rPr>
+          <w:rFonts w:ascii="Times New Roman" w:eastAsia="Times New Roman" w:hAnsi="Times New Roman" w:cs="Times New Roman"/>
+          <w:kern w:val="0"/>
+          <w:sz w:val="24"/>
+          <w:szCs w:val="24"/>
+          <w:lang w:eastAsia="en-IN"/>
+          <w14:ligatures w14:val="none"/>
+        </w:rPr>
+      </w:pPr>
+      <w:r>
+        <w:rPr>
+          <w:rFonts w:ascii="Times New Roman" w:eastAsia="Times New Roman" w:hAnsi="Times New Roman" w:cs="Times New Roman"/>
+          <w:b/>
+          <w:bCs/>
+          <w:kern w:val="0"/>
+          <w:sz w:val="24"/>
+          <w:szCs w:val="24"/>
+          <w:lang w:eastAsia="en-IN"/>
+          <w14:ligatures w14:val="none"/>
+        </w:rPr>
+        <w:t xml:space="preserve">Option 2 — Control via </w:t>
+      </w:r>
+      <w:r>
+        <w:rPr>
+          <w:rFonts w:ascii="Courier New" w:eastAsia="Times New Roman" w:hAnsi="Courier New" w:cs="Courier New"/>
+          <w:b/>
+          <w:bCs/>
+          <w:kern w:val="0"/>
+          <w:sz w:val="20"/>
+          <w:szCs w:val="20"/>
+          <w:lang w:eastAsia="en-IN"/>
+          <w14:ligatures w14:val="none"/>
+        </w:rPr>
+        <w:t>agent.md</w:t>
+      </w:r>
+      <w:r>
+        <w:rPr>
+          <w:rFonts w:ascii="Times New Roman" w:eastAsia="Times New Roman" w:hAnsi="Times New Roman" w:cs="Times New Roman"/>
+          <w:kern w:val="0"/>
+          <w:sz w:val="24"/>
+          <w:szCs w:val="24"/>
+          <w:lang w:eastAsia="en-IN"/>
+          <w14:ligatures w14:val="none"/>
+        </w:rPr>
+        <w:t xml:space="preserve"> (tell it to run all steps automatically):</w:t>
+      </w:r>
+    </w:p>
+    <w:p>
+      <w:pPr>
+        <w:spacing w:after="0" w:line="240" w:lineRule="auto"/>
+        <w:rPr>
+          <w:rFonts w:ascii="Times New Roman" w:eastAsia="Times New Roman" w:hAnsi="Times New Roman" w:cs="Times New Roman"/>
+          <w:kern w:val="0"/>
+          <w:sz w:val="24"/>
+          <w:szCs w:val="24"/>
+          <w:lang w:eastAsia="en-IN"/>
+          <w14:ligatures w14:val="none"/>
+        </w:rPr>
+      </w:pPr>
+      <w:r>
+        <w:rPr>
+          <w:rFonts w:ascii="Times New Roman" w:eastAsia="Times New Roman" w:hAnsi="Times New Roman" w:cs="Times New Roman"/>
+          <w:kern w:val="0"/>
+          <w:sz w:val="24"/>
+          <w:szCs w:val="24"/>
+          <w:lang w:eastAsia="en-IN"/>
+          <w14:ligatures w14:val="none"/>
+        </w:rPr>
+        <w:t>markdown</w:t>
+      </w:r>
+    </w:p>
+    <w:p>
+      <w:pPr>
+        <w:tabs>
+          <w:tab w:val="left" w:pos="916"/>
+          <w:tab w:val="left" w:pos="1832"/>
+          <w:tab w:val="left" w:pos="2748"/>
+          <w:tab w:val="left" w:pos="3664"/>
+          <w:tab w:val="left" w:pos="4580"/>
+          <w:tab w:val="left" w:pos="5496"/>
+          <w:tab w:val="left" w:pos="6412"/>
+          <w:tab w:val="left" w:pos="7328"/>
+          <w:tab w:val="left" w:pos="8244"/>
+          <w:tab w:val="left" w:pos="9160"/>
+          <w:tab w:val="left" w:pos="10076"/>
+          <w:tab w:val="left" w:pos="10992"/>
+          <w:tab w:val="left" w:pos="11908"/>
+          <w:tab w:val="left" w:pos="12824"/>
+          <w:tab w:val="left" w:pos="13740"/>
+          <w:tab w:val="left" w:pos="14656"/>
+        </w:tabs>
+        <w:spacing w:after="0" w:line="240" w:lineRule="auto"/>
+        <w:rPr>
+          <w:rFonts w:ascii="var(--font-mono)" w:eastAsia="Times New Roman" w:hAnsi="var(--font-mono)" w:cs="Courier New"/>
+          <w:color w:val="14181F"/>
+          <w:kern w:val="0"/>
+          <w:sz w:val="20"/>
+          <w:szCs w:val="20"/>
+          <w:lang w:eastAsia="en-IN"/>
+          <w14:ligatures w14:val="none"/>
+        </w:rPr>
+      </w:pPr>
+      <w:r>
+        <w:rPr>
+          <w:rFonts w:ascii="var(--font-mono)" w:eastAsia="Times New Roman" w:hAnsi="var(--font-mono)" w:cs="Courier New"/>
+          <w:b/>
+          <w:bCs/>
+          <w:color w:val="2B303B"/>
+          <w:kern w:val="0"/>
+          <w:sz w:val="20"/>
+          <w:szCs w:val="20"/>
+          <w:lang w:eastAsia="en-IN"/>
+          <w14:ligatures w14:val="none"/>
+        </w:rPr>
+        <w:t>##</w:t>
+      </w:r>
+      <w:r>
+        <w:rPr>
+          <w:rFonts w:ascii="var(--font-mono)" w:eastAsia="Times New Roman" w:hAnsi="var(--font-mono)" w:cs="Courier New"/>
+          <w:b/>
+          <w:bCs/>
+          <w:color w:val="B80A18"/>
+          <w:kern w:val="0"/>
+          <w:sz w:val="20"/>
+          <w:szCs w:val="20"/>
+          <w:lang w:eastAsia="en-IN"/>
+          <w14:ligatures w14:val="none"/>
+        </w:rPr>
+        <w:t xml:space="preserve"> Execution Rules</w:t>
+      </w:r>
+    </w:p>
+    <w:p>
+      <w:pPr>
+        <w:tabs>
+          <w:tab w:val="left" w:pos="916"/>
+          <w:tab w:val="left" w:pos="1832"/>
+          <w:tab w:val="left" w:pos="2748"/>
+          <w:tab w:val="left" w:pos="3664"/>
+          <w:tab w:val="left" w:pos="4580"/>
+          <w:tab w:val="left" w:pos="5496"/>
+          <w:tab w:val="left" w:pos="6412"/>
+          <w:tab w:val="left" w:pos="7328"/>
+          <w:tab w:val="left" w:pos="8244"/>
+          <w:tab w:val="left" w:pos="9160"/>
+          <w:tab w:val="left" w:pos="10076"/>
+          <w:tab w:val="left" w:pos="10992"/>
+          <w:tab w:val="left" w:pos="11908"/>
+          <w:tab w:val="left" w:pos="12824"/>
+          <w:tab w:val="left" w:pos="13740"/>
+          <w:tab w:val="left" w:pos="14656"/>
+        </w:tabs>
+        <w:spacing w:after="0" w:line="240" w:lineRule="auto"/>
+        <w:rPr>
+          <w:rFonts w:ascii="var(--font-mono)" w:eastAsia="Times New Roman" w:hAnsi="var(--font-mono)" w:cs="Courier New"/>
+          <w:color w:val="14181F"/>
+          <w:kern w:val="0"/>
+          <w:sz w:val="20"/>
+          <w:szCs w:val="20"/>
+          <w:lang w:eastAsia="en-IN"/>
+          <w14:ligatures w14:val="none"/>
+        </w:rPr>
+      </w:pPr>
+      <w:r>
+        <w:rPr>
+          <w:rFonts w:ascii="var(--font-mono)" w:eastAsia="Times New Roman" w:hAnsi="var(--font-mono)" w:cs="Courier New"/>
+          <w:color w:val="2B303B"/>
+          <w:kern w:val="0"/>
+          <w:sz w:val="20"/>
+          <w:szCs w:val="20"/>
+          <w:lang w:eastAsia="en-IN"/>
+          <w14:ligatures w14:val="none"/>
+        </w:rPr>
+        <w:t>-</w:t>
+      </w:r>
+      <w:r>
+        <w:rPr>
+          <w:rFonts w:ascii="var(--font-mono)" w:eastAsia="Times New Roman" w:hAnsi="var(--font-mono)" w:cs="Courier New"/>
+          <w:color w:val="14181F"/>
+          <w:kern w:val="0"/>
+          <w:sz w:val="20"/>
+          <w:szCs w:val="20"/>
+          <w:lang w:eastAsia="en-IN"/>
+          <w14:ligatures w14:val="none"/>
+        </w:rPr>
+        <w:t xml:space="preserve"> Run ALL skills in sequence without waiting for confirmation</w:t>
+      </w:r>
+    </w:p>
+    <w:p>
+      <w:pPr>
+        <w:tabs>
+          <w:tab w:val="left" w:pos="916"/>
+          <w:tab w:val="left" w:pos="1832"/>
+          <w:tab w:val="left" w:pos="2748"/>
+          <w:tab w:val="left" w:pos="3664"/>
+          <w:tab w:val="left" w:pos="4580"/>
+          <w:tab w:val="left" w:pos="5496"/>
+          <w:tab w:val="left" w:pos="6412"/>
+          <w:tab w:val="left" w:pos="7328"/>
+          <w:tab w:val="left" w:pos="8244"/>
+          <w:tab w:val="left" w:pos="9160"/>
+          <w:tab w:val="left" w:pos="10076"/>
+          <w:tab w:val="left" w:pos="10992"/>
+          <w:tab w:val="left" w:pos="11908"/>
+          <w:tab w:val="left" w:pos="12824"/>
+          <w:tab w:val="left" w:pos="13740"/>
+          <w:tab w:val="left" w:pos="14656"/>
+        </w:tabs>
+        <w:spacing w:after="0" w:line="240" w:lineRule="auto"/>
+        <w:rPr>
+          <w:rFonts w:ascii="var(--font-mono)" w:eastAsia="Times New Roman" w:hAnsi="var(--font-mono)" w:cs="Courier New"/>
+          <w:color w:val="14181F"/>
+          <w:kern w:val="0"/>
+          <w:sz w:val="20"/>
+          <w:szCs w:val="20"/>
+          <w:lang w:eastAsia="en-IN"/>
+          <w14:ligatures w14:val="none"/>
+        </w:rPr>
+      </w:pPr>
+      <w:r>
+        <w:rPr>
+          <w:rFonts w:ascii="var(--font-mono)" w:eastAsia="Times New Roman" w:hAnsi="var(--font-mono)" w:cs="Courier New"/>
+          <w:color w:val="2B303B"/>
+          <w:kern w:val="0"/>
+          <w:sz w:val="20"/>
+          <w:szCs w:val="20"/>
+          <w:lang w:eastAsia="en-IN"/>
+          <w14:ligatures w14:val="none"/>
+        </w:rPr>
+        <w:t>-</w:t>
+      </w:r>
+      <w:r>
+        <w:rPr>
+          <w:rFonts w:ascii="var(--font-mono)" w:eastAsia="Times New Roman" w:hAnsi="var(--font-mono)" w:cs="Courier New"/>
+          <w:color w:val="14181F"/>
+          <w:kern w:val="0"/>
+          <w:sz w:val="20"/>
+          <w:szCs w:val="20"/>
+          <w:lang w:eastAsia="en-IN"/>
+          <w14:ligatures w14:val="none"/>
+        </w:rPr>
+        <w:t xml:space="preserve"> Do not pause between skills unless an error occurs</w:t>
+      </w:r>
+    </w:p>
+    <w:p>
+      <w:pPr>
+        <w:spacing w:before="100" w:beforeAutospacing="1" w:after="100" w:afterAutospacing="1" w:line="240" w:lineRule="auto"/>
+        <w:rPr>
+          <w:rFonts w:ascii="Times New Roman" w:eastAsia="Times New Roman" w:hAnsi="Times New Roman" w:cs="Times New Roman"/>
+          <w:kern w:val="0"/>
+          <w:sz w:val="24"/>
+          <w:szCs w:val="24"/>
+          <w:lang w:eastAsia="en-IN"/>
+          <w14:ligatures w14:val="none"/>
+        </w:rPr>
+      </w:pPr>
+      <w:r>
+        <w:rPr>
+          <w:rFonts w:ascii="Times New Roman" w:eastAsia="Times New Roman" w:hAnsi="Times New Roman" w:cs="Times New Roman"/>
+          <w:b/>
+          <w:bCs/>
+          <w:kern w:val="0"/>
+          <w:sz w:val="24"/>
+          <w:szCs w:val="24"/>
+          <w:lang w:eastAsia="en-IN"/>
+          <w14:ligatures w14:val="none"/>
+        </w:rPr>
+        <w:t>Option 3 — Explicit in your query</w:t>
+      </w:r>
+      <w:r>
+        <w:rPr>
+          <w:rFonts w:ascii="Times New Roman" w:eastAsia="Times New Roman" w:hAnsi="Times New Roman" w:cs="Times New Roman"/>
+          <w:kern w:val="0"/>
+          <w:sz w:val="24"/>
+          <w:szCs w:val="24"/>
+          <w:lang w:eastAsia="en-IN"/>
+          <w14:ligatures w14:val="none"/>
+        </w:rPr>
+        <w:t>:</w:t>
+      </w:r>
+    </w:p>
+    <w:p>
+      <w:pPr>
+        <w:tabs>
+          <w:tab w:val="left" w:pos="916"/>
+          <w:tab w:val="left" w:pos="1832"/>
+          <w:tab w:val="left" w:pos="2748"/>
+          <w:tab w:val="left" w:pos="3664"/>
+          <w:tab w:val="left" w:pos="4580"/>
+          <w:tab w:val="left" w:pos="5496"/>
+          <w:tab w:val="left" w:pos="6412"/>
+          <w:tab w:val="left" w:pos="7328"/>
+          <w:tab w:val="left" w:pos="8244"/>
+          <w:tab w:val="left" w:pos="9160"/>
+          <w:tab w:val="left" w:pos="10076"/>
+          <w:tab w:val="left" w:pos="10992"/>
+          <w:tab w:val="left" w:pos="11908"/>
+          <w:tab w:val="left" w:pos="12824"/>
+          <w:tab w:val="left" w:pos="13740"/>
+          <w:tab w:val="left" w:pos="14656"/>
+        </w:tabs>
+        <w:spacing w:after="0" w:line="240" w:lineRule="auto"/>
+        <w:rPr>
+          <w:rFonts w:ascii="var(--font-mono)" w:eastAsia="Times New Roman" w:hAnsi="var(--font-mono)" w:cs="Courier New"/>
+          <w:color w:val="14181F"/>
+          <w:kern w:val="0"/>
+          <w:sz w:val="20"/>
+          <w:szCs w:val="20"/>
+          <w:lang w:eastAsia="en-IN"/>
+          <w14:ligatures w14:val="none"/>
+        </w:rPr>
+      </w:pPr>
+      <w:r>
+        <w:rPr>
+          <w:rFonts w:ascii="var(--font-mono)" w:eastAsia="Times New Roman" w:hAnsi="var(--font-mono)" w:cs="Courier New"/>
+          <w:color w:val="14181F"/>
+          <w:kern w:val="0"/>
+          <w:sz w:val="20"/>
+          <w:szCs w:val="20"/>
+          <w:lang w:eastAsia="en-IN"/>
+          <w14:ligatures w14:val="none"/>
+        </w:rPr>
+        <w:t>analyze apache_access.log and run all skills including error detection, patterns and report</w:t>
+      </w:r>
+    </w:p>
+    <w:p>
+      <w:pPr>
+        <w:spacing w:before="100" w:beforeAutospacing="1" w:after="100" w:afterAutospacing="1" w:line="240" w:lineRule="auto"/>
+        <w:rPr>
+          <w:rFonts w:ascii="Times New Roman" w:eastAsia="Times New Roman" w:hAnsi="Times New Roman" w:cs="Times New Roman"/>
+          <w:kern w:val="0"/>
+          <w:sz w:val="24"/>
+          <w:szCs w:val="24"/>
+          <w:lang w:eastAsia="en-IN"/>
+          <w14:ligatures w14:val="none"/>
+        </w:rPr>
+      </w:pPr>
+      <w:r>
+        <w:rPr>
+          <w:rFonts w:ascii="Times New Roman" w:eastAsia="Times New Roman" w:hAnsi="Times New Roman" w:cs="Times New Roman"/>
+          <w:kern w:val="0"/>
+          <w:sz w:val="24"/>
+          <w:szCs w:val="24"/>
+          <w:lang w:eastAsia="en-IN"/>
+          <w14:ligatures w14:val="none"/>
+        </w:rPr>
+        <w:t>This pre-answers all the "if requested" conditions upfront.</w:t>
+      </w:r>
+    </w:p>
+    <w:p>
+      <w:pPr>
+        <w:spacing w:before="100" w:beforeAutospacing="1" w:after="100" w:afterAutospacing="1" w:line="240" w:lineRule="auto"/>
+        <w:outlineLvl w:val="2"/>
+        <w:rPr>
+          <w:rFonts w:ascii="Times New Roman" w:eastAsia="Times New Roman" w:hAnsi="Times New Roman" w:cs="Times New Roman"/>
+          <w:b/>
+          <w:bCs/>
+          <w:kern w:val="0"/>
+          <w:sz w:val="27"/>
+          <w:szCs w:val="27"/>
+          <w:lang w:eastAsia="en-IN"/>
+          <w14:ligatures w14:val="none"/>
+        </w:rPr>
+      </w:pPr>
+      <w:r>
+        <w:rPr>
+          <w:rFonts w:ascii="Times New Roman" w:eastAsia="Times New Roman" w:hAnsi="Times New Roman" w:cs="Times New Roman"/>
+          <w:b/>
+          <w:bCs/>
+          <w:kern w:val="0"/>
+          <w:sz w:val="27"/>
+          <w:szCs w:val="27"/>
+          <w:lang w:eastAsia="en-IN"/>
+          <w14:ligatures w14:val="none"/>
+        </w:rPr>
+        <w:t xml:space="preserve">Where </w:t>
+      </w:r>
+      <w:r>
+        <w:rPr>
+          <w:rFonts w:ascii="Courier New" w:eastAsia="Times New Roman" w:hAnsi="Courier New" w:cs="Courier New"/>
+          <w:b/>
+          <w:bCs/>
+          <w:kern w:val="0"/>
+          <w:sz w:val="20"/>
+          <w:szCs w:val="20"/>
+          <w:lang w:eastAsia="en-IN"/>
+          <w14:ligatures w14:val="none"/>
+        </w:rPr>
+        <w:t>if requested</w:t>
+      </w:r>
+      <w:r>
+        <w:rPr>
+          <w:rFonts w:ascii="Times New Roman" w:eastAsia="Times New Roman" w:hAnsi="Times New Roman" w:cs="Times New Roman"/>
+          <w:b/>
+          <w:bCs/>
+          <w:kern w:val="0"/>
+          <w:sz w:val="27"/>
+          <w:szCs w:val="27"/>
+          <w:lang w:eastAsia="en-IN"/>
+          <w14:ligatures w14:val="none"/>
+        </w:rPr>
+        <w:t xml:space="preserve"> Comes From</w:t>
+      </w:r>
+    </w:p>
+    <w:p>
+      <w:pPr>
+        <w:spacing w:before="100" w:beforeAutospacing="1" w:after="100" w:afterAutospacing="1" w:line="240" w:lineRule="auto"/>
+        <w:rPr>
+          <w:rFonts w:ascii="Times New Roman" w:eastAsia="Times New Roman" w:hAnsi="Times New Roman" w:cs="Times New Roman"/>
+          <w:kern w:val="0"/>
+          <w:sz w:val="24"/>
+          <w:szCs w:val="24"/>
+          <w:lang w:eastAsia="en-IN"/>
+          <w14:ligatures w14:val="none"/>
+        </w:rPr>
+      </w:pPr>
+      <w:r>
+        <w:rPr>
+          <w:rFonts w:ascii="Times New Roman" w:eastAsia="Times New Roman" w:hAnsi="Times New Roman" w:cs="Times New Roman"/>
+          <w:kern w:val="0"/>
+          <w:sz w:val="24"/>
+          <w:szCs w:val="24"/>
+          <w:lang w:eastAsia="en-IN"/>
+          <w14:ligatures w14:val="none"/>
+        </w:rPr>
+        <w:t xml:space="preserve">It's your </w:t>
+      </w:r>
+      <w:r>
+        <w:rPr>
+          <w:rFonts w:ascii="Courier New" w:eastAsia="Times New Roman" w:hAnsi="Courier New" w:cs="Courier New"/>
+          <w:kern w:val="0"/>
+          <w:sz w:val="20"/>
+          <w:szCs w:val="20"/>
+          <w:lang w:eastAsia="en-IN"/>
+          <w14:ligatures w14:val="none"/>
+        </w:rPr>
+        <w:t>agent.md</w:t>
+      </w:r>
+      <w:r>
+        <w:rPr>
+          <w:rFonts w:ascii="Times New Roman" w:eastAsia="Times New Roman" w:hAnsi="Times New Roman" w:cs="Times New Roman"/>
+          <w:kern w:val="0"/>
+          <w:sz w:val="24"/>
+          <w:szCs w:val="24"/>
+          <w:lang w:eastAsia="en-IN"/>
+          <w14:ligatures w14:val="none"/>
+        </w:rPr>
+        <w:t xml:space="preserve"> wording:</w:t>
+      </w:r>
+    </w:p>
+    <w:p>
+      <w:pPr>
+        <w:spacing w:after="0" w:line="240" w:lineRule="auto"/>
+        <w:rPr>
+          <w:rFonts w:ascii="Times New Roman" w:eastAsia="Times New Roman" w:hAnsi="Times New Roman" w:cs="Times New Roman"/>
+          <w:kern w:val="0"/>
+          <w:sz w:val="24"/>
+          <w:szCs w:val="24"/>
+          <w:lang w:eastAsia="en-IN"/>
+          <w14:ligatures w14:val="none"/>
+        </w:rPr>
+      </w:pPr>
+      <w:r>
+        <w:rPr>
+          <w:rFonts w:ascii="Times New Roman" w:eastAsia="Times New Roman" w:hAnsi="Times New Roman" w:cs="Times New Roman"/>
+          <w:kern w:val="0"/>
+          <w:sz w:val="24"/>
+          <w:szCs w:val="24"/>
+          <w:lang w:eastAsia="en-IN"/>
+          <w14:ligatures w14:val="none"/>
+        </w:rPr>
+        <w:t>markdown</w:t>
+      </w:r>
+    </w:p>
+    <w:p>
+      <w:pPr>
+        <w:tabs>
+          <w:tab w:val="left" w:pos="916"/>
+          <w:tab w:val="left" w:pos="1832"/>
+          <w:tab w:val="left" w:pos="2748"/>
+          <w:tab w:val="left" w:pos="3664"/>
+          <w:tab w:val="left" w:pos="4580"/>
+          <w:tab w:val="left" w:pos="5496"/>
+          <w:tab w:val="left" w:pos="6412"/>
+          <w:tab w:val="left" w:pos="7328"/>
+          <w:tab w:val="left" w:pos="8244"/>
+          <w:tab w:val="left" w:pos="9160"/>
+          <w:tab w:val="left" w:pos="10076"/>
+          <w:tab w:val="left" w:pos="10992"/>
+          <w:tab w:val="left" w:pos="11908"/>
+          <w:tab w:val="left" w:pos="12824"/>
+          <w:tab w:val="left" w:pos="13740"/>
+          <w:tab w:val="left" w:pos="14656"/>
+        </w:tabs>
+        <w:spacing w:after="0" w:line="240" w:lineRule="auto"/>
+        <w:rPr>
+          <w:rFonts w:ascii="var(--font-mono)" w:eastAsia="Times New Roman" w:hAnsi="var(--font-mono)" w:cs="Courier New"/>
+          <w:color w:val="14181F"/>
+          <w:kern w:val="0"/>
+          <w:sz w:val="20"/>
+          <w:szCs w:val="20"/>
+          <w:lang w:eastAsia="en-IN"/>
+          <w14:ligatures w14:val="none"/>
+        </w:rPr>
+      </w:pPr>
+      <w:r>
+        <w:rPr>
+          <w:rFonts w:ascii="var(--font-mono)" w:eastAsia="Times New Roman" w:hAnsi="var(--font-mono)" w:cs="Courier New"/>
+          <w:color w:val="2B303B"/>
+          <w:kern w:val="0"/>
+          <w:sz w:val="20"/>
+          <w:szCs w:val="20"/>
+          <w:lang w:eastAsia="en-IN"/>
+          <w14:ligatures w14:val="none"/>
+        </w:rPr>
+        <w:t>**</w:t>
+      </w:r>
+      <w:r>
+        <w:rPr>
+          <w:rFonts w:ascii="var(--font-mono)" w:eastAsia="Times New Roman" w:hAnsi="var(--font-mono)" w:cs="Courier New"/>
+          <w:color w:val="14181F"/>
+          <w:kern w:val="0"/>
+          <w:sz w:val="20"/>
+          <w:szCs w:val="20"/>
+          <w:lang w:eastAsia="en-IN"/>
+          <w14:ligatures w14:val="none"/>
+        </w:rPr>
+        <w:t>Invoke when</w:t>
+      </w:r>
+      <w:r>
+        <w:rPr>
+          <w:rFonts w:ascii="var(--font-mono)" w:eastAsia="Times New Roman" w:hAnsi="var(--font-mono)" w:cs="Courier New"/>
+          <w:color w:val="2B303B"/>
+          <w:kern w:val="0"/>
+          <w:sz w:val="20"/>
+          <w:szCs w:val="20"/>
+          <w:lang w:eastAsia="en-IN"/>
+          <w14:ligatures w14:val="none"/>
+        </w:rPr>
+        <w:t>**</w:t>
+      </w:r>
+      <w:r>
+        <w:rPr>
+          <w:rFonts w:ascii="var(--font-mono)" w:eastAsia="Times New Roman" w:hAnsi="var(--font-mono)" w:cs="Courier New"/>
+          <w:color w:val="14181F"/>
+          <w:kern w:val="0"/>
+          <w:sz w:val="20"/>
+          <w:szCs w:val="20"/>
+          <w:lang w:eastAsia="en-IN"/>
+          <w14:ligatures w14:val="none"/>
+        </w:rPr>
+        <w:t>: user asks for "errors"   ← this creates the conditional todo</w:t>
+      </w:r>
+    </w:p>
+    <w:p>
+      <w:pPr>
+        <w:spacing w:before="100" w:beforeAutospacing="1" w:after="100" w:afterAutospacing="1" w:line="240" w:lineRule="auto"/>
+        <w:rPr>
+          <w:rFonts w:ascii="Times New Roman" w:eastAsia="Times New Roman" w:hAnsi="Times New Roman" w:cs="Times New Roman"/>
+          <w:kern w:val="0"/>
+          <w:sz w:val="24"/>
+          <w:szCs w:val="24"/>
+          <w:lang w:eastAsia="en-IN"/>
+          <w14:ligatures w14:val="none"/>
+        </w:rPr>
+      </w:pPr>
+      <w:r>
+        <w:rPr>
+          <w:rFonts w:ascii="Times New Roman" w:eastAsia="Times New Roman" w:hAnsi="Times New Roman" w:cs="Times New Roman"/>
+          <w:kern w:val="0"/>
+          <w:sz w:val="24"/>
+          <w:szCs w:val="24"/>
+          <w:lang w:eastAsia="en-IN"/>
+          <w14:ligatures w14:val="none"/>
+        </w:rPr>
+        <w:t>Change to make it unconditional:</w:t>
+      </w:r>
+    </w:p>
+    <w:p>
+      <w:pPr>
+        <w:spacing w:after="0" w:line="240" w:lineRule="auto"/>
+        <w:rPr>
+          <w:rFonts w:ascii="Times New Roman" w:eastAsia="Times New Roman" w:hAnsi="Times New Roman" w:cs="Times New Roman"/>
+          <w:kern w:val="0"/>
+          <w:sz w:val="24"/>
+          <w:szCs w:val="24"/>
+          <w:lang w:eastAsia="en-IN"/>
+          <w14:ligatures w14:val="none"/>
+        </w:rPr>
+      </w:pPr>
+      <w:r>
+        <w:rPr>
+          <w:rFonts w:ascii="Times New Roman" w:eastAsia="Times New Roman" w:hAnsi="Times New Roman" w:cs="Times New Roman"/>
+          <w:kern w:val="0"/>
+          <w:sz w:val="24"/>
+          <w:szCs w:val="24"/>
+          <w:lang w:eastAsia="en-IN"/>
+          <w14:ligatures w14:val="none"/>
+        </w:rPr>
+        <w:lastRenderedPageBreak/>
+        <w:t>markdown</w:t>
+      </w:r>
+    </w:p>
+    <w:p>
+      <w:pPr>
+        <w:tabs>
+          <w:tab w:val="left" w:pos="916"/>
+          <w:tab w:val="left" w:pos="1832"/>
+          <w:tab w:val="left" w:pos="2748"/>
+          <w:tab w:val="left" w:pos="3664"/>
+          <w:tab w:val="left" w:pos="4580"/>
+          <w:tab w:val="left" w:pos="5496"/>
+          <w:tab w:val="left" w:pos="6412"/>
+          <w:tab w:val="left" w:pos="7328"/>
+          <w:tab w:val="left" w:pos="8244"/>
+          <w:tab w:val="left" w:pos="9160"/>
+          <w:tab w:val="left" w:pos="10076"/>
+          <w:tab w:val="left" w:pos="10992"/>
+          <w:tab w:val="left" w:pos="11908"/>
+          <w:tab w:val="left" w:pos="12824"/>
+          <w:tab w:val="left" w:pos="13740"/>
+          <w:tab w:val="left" w:pos="14656"/>
+        </w:tabs>
+        <w:spacing w:after="0" w:line="240" w:lineRule="auto"/>
+        <w:rPr>
+          <w:rFonts w:ascii="var(--font-mono)" w:eastAsia="Times New Roman" w:hAnsi="var(--font-mono)" w:cs="Courier New"/>
+          <w:color w:val="14181F"/>
+          <w:kern w:val="0"/>
+          <w:sz w:val="20"/>
+          <w:szCs w:val="20"/>
+          <w:lang w:eastAsia="en-IN"/>
+          <w14:ligatures w14:val="none"/>
+        </w:rPr>
+      </w:pPr>
+      <w:r>
+        <w:rPr>
+          <w:rFonts w:ascii="var(--font-mono)" w:eastAsia="Times New Roman" w:hAnsi="var(--font-mono)" w:cs="Courier New"/>
+          <w:color w:val="2B303B"/>
+          <w:kern w:val="0"/>
+          <w:sz w:val="20"/>
+          <w:szCs w:val="20"/>
+          <w:lang w:eastAsia="en-IN"/>
+          <w14:ligatures w14:val="none"/>
+        </w:rPr>
+        <w:t>**</w:t>
+      </w:r>
+      <w:r>
+        <w:rPr>
+          <w:rFonts w:ascii="var(--font-mono)" w:eastAsia="Times New Roman" w:hAnsi="var(--font-mono)" w:cs="Courier New"/>
+          <w:color w:val="14181F"/>
+          <w:kern w:val="0"/>
+          <w:sz w:val="20"/>
+          <w:szCs w:val="20"/>
+          <w:lang w:eastAsia="en-IN"/>
+          <w14:ligatures w14:val="none"/>
+        </w:rPr>
+        <w:t>Invoke when</w:t>
+      </w:r>
+      <w:r>
+        <w:rPr>
+          <w:rFonts w:ascii="var(--font-mono)" w:eastAsia="Times New Roman" w:hAnsi="var(--font-mono)" w:cs="Courier New"/>
+          <w:color w:val="2B303B"/>
+          <w:kern w:val="0"/>
+          <w:sz w:val="20"/>
+          <w:szCs w:val="20"/>
+          <w:lang w:eastAsia="en-IN"/>
+          <w14:ligatures w14:val="none"/>
+        </w:rPr>
+        <w:t>**</w:t>
+      </w:r>
+      <w:r>
+        <w:rPr>
+          <w:rFonts w:ascii="var(--font-mono)" w:eastAsia="Times New Roman" w:hAnsi="var(--font-mono)" w:cs="Courier New"/>
+          <w:color w:val="14181F"/>
+          <w:kern w:val="0"/>
+          <w:sz w:val="20"/>
+          <w:szCs w:val="20"/>
+          <w:lang w:eastAsia="en-IN"/>
+          <w14:ligatures w14:val="none"/>
+        </w:rPr>
+        <w:t>: always run after log-parsing completes</w:t>
+      </w:r>
+    </w:p>
+    <w:p>
+      <w:pPr>
+        <w:spacing w:before="100" w:beforeAutospacing="1" w:after="100" w:afterAutospacing="1" w:line="240" w:lineRule="auto"/>
+        <w:rPr>
+          <w:rFonts w:ascii="Times New Roman" w:eastAsia="Times New Roman" w:hAnsi="Times New Roman" w:cs="Times New Roman"/>
+          <w:kern w:val="0"/>
+          <w:sz w:val="24"/>
+          <w:szCs w:val="24"/>
+          <w:lang w:eastAsia="en-IN"/>
+          <w14:ligatures w14:val="none"/>
+        </w:rPr>
+      </w:pPr>
+      <w:r>
+        <w:rPr>
+          <w:rFonts w:ascii="Times New Roman" w:eastAsia="Times New Roman" w:hAnsi="Times New Roman" w:cs="Times New Roman"/>
+          <w:kern w:val="0"/>
+          <w:sz w:val="24"/>
+          <w:szCs w:val="24"/>
+          <w:lang w:eastAsia="en-IN"/>
+          <w14:ligatures w14:val="none"/>
+        </w:rPr>
+        <w:t>This removes the conditional and makes the todo auto-execute.</w:t>
       </w:r>
     </w:p>
     <w:p/>

</xml_diff>